<commit_message>
feat(v1b): PSS model generator, structural checker, 26 tests passing
</commit_message>
<xml_diff>
--- a/docs/pssgen_sds.docx
+++ b/docs/pssgen_sds.docx
@@ -12729,6 +12729,166 @@
           <w:szCs w:val="18"/>
         </w:rPr>
         <w:t xml:space="preserve">End of document  —  SDS-PSSGEN-001 v0.1</w:t>
+      </w:r>
+    </w:p>
+    <w:p>
+      <w:r>
+        <w:br w:type="page"/>
+      </w:r>
+    </w:p>
+    <w:p>
+      <w:r>
+        <w:t>9.  Revision Update - v1 Reality</w:t>
+      </w:r>
+    </w:p>
+    <w:p>
+      <w:r>
+        <w:t>Revision Date: 2026-03-27</w:t>
+      </w:r>
+    </w:p>
+    <w:p>
+      <w:r>
+        <w:t>This addendum supersedes v0-only assumptions and records current v1 implementation state for parser scope, parser dispatch, PSS generation, and known open issues.</w:t>
+      </w:r>
+    </w:p>
+    <w:p>
+      <w:r>
+        <w:t>9.1  VHDL Parser Scope (v1a Implemented)</w:t>
+      </w:r>
+    </w:p>
+    <w:p>
+      <w:r>
+        <w:t>- Module: parser/vhdl.py</w:t>
+      </w:r>
+    </w:p>
+    <w:p>
+      <w:r>
+        <w:t>- Accepted port types: std_logic, std_logic_vector(N downto 0), std_logic_vector(0 to N).</w:t>
+      </w:r>
+    </w:p>
+    <w:p>
+      <w:r>
+        <w:t>- Mode mapping to IR: in-&gt;input, out-&gt;output, inout-&gt;inout, buffer-&gt;output.</w:t>
+      </w:r>
+    </w:p>
+    <w:p>
+      <w:r>
+        <w:t>- Integer generics are extracted as string defaults in IR.parameters.</w:t>
+      </w:r>
+    </w:p>
+    <w:p>
+      <w:r>
+        <w:t>- Role inference matches verilog parser heuristics (clock/reset/control/data).</w:t>
+      </w:r>
+    </w:p>
+    <w:p>
+      <w:r>
+        <w:t>- Unsupported port types raise ParseError naming both the type and port.</w:t>
+      </w:r>
+    </w:p>
+    <w:p>
+      <w:r>
+        <w:t>9.2  Extension-Based Parser Dispatch (v1a Implemented)</w:t>
+      </w:r>
+    </w:p>
+    <w:p>
+      <w:r>
+        <w:t>- Module: parser/dispatch.py</w:t>
+      </w:r>
+    </w:p>
+    <w:p>
+      <w:r>
+        <w:t>- Dispatch mapping: .v-&gt;parser.verilog.parse, .sv-&gt;parser.systemverilog.parse, .vhd/.vhdl-&gt;parser.vhdl.parse.</w:t>
+      </w:r>
+    </w:p>
+    <w:p>
+      <w:r>
+        <w:t>- CLI validates extension dispatch and exits with code 3 on unsupported extensions.</w:t>
+      </w:r>
+    </w:p>
+    <w:p>
+      <w:r>
+        <w:t>- Orchestrator parses via shared dispatch helper to avoid duplication and maintain consistent behavior.</w:t>
+      </w:r>
+    </w:p>
+    <w:p>
+      <w:r>
+        <w:t>9.3  PSS Model Generator Agent (v1b Implemented)</w:t>
+      </w:r>
+    </w:p>
+    <w:p>
+      <w:r>
+        <w:t>- Module: agents/pss_gen.py</w:t>
+      </w:r>
+    </w:p>
+    <w:p>
+      <w:r>
+        <w:t>- Public interface: generate_pss(ir, fail_reason=None, no_llm=False) -&gt; str.</w:t>
+      </w:r>
+    </w:p>
+    <w:p>
+      <w:r>
+        <w:t>- Template path: templates/pss/component.pss.jinja defines component/action skeleton with constraint and coverage placeholders.</w:t>
+      </w:r>
+    </w:p>
+    <w:p>
+      <w:r>
+        <w:t>- no_llm=True renders template only and performs no API calls.</w:t>
+      </w:r>
+    </w:p>
+    <w:p>
+      <w:r>
+        <w:t>- no_llm=False performs skeleton-first prompting and returns LLM-completed PSS source.</w:t>
+      </w:r>
+    </w:p>
+    <w:p>
+      <w:r>
+        <w:t>- Generated source is stored in ir.pss_model and emitted as &lt;design_name&gt;.pss alongside UVM artifacts.</w:t>
+      </w:r>
+    </w:p>
+    <w:p>
+      <w:r>
+        <w:t>9.4  Checker Integration for PSS Structural Validation (v1b Implemented)</w:t>
+      </w:r>
+    </w:p>
+    <w:p>
+      <w:r>
+        <w:t>- Module: checkers/verifier.py</w:t>
+      </w:r>
+    </w:p>
+    <w:p>
+      <w:r>
+        <w:t>- Tier-1 PSS check validates .pss artifacts contain: component keyword, action keyword, and design name.</w:t>
+      </w:r>
+    </w:p>
+    <w:p>
+      <w:r>
+        <w:t>- PSS structural checks run in tier 1 before syntax/smoke stages when .pss artifacts are present.</w:t>
+      </w:r>
+    </w:p>
+    <w:p>
+      <w:r>
+        <w:t>9.5  Open Issue OI-10 (Formally Recorded)</w:t>
+      </w:r>
+    </w:p>
+    <w:p>
+      <w:r>
+        <w:t>- OI-10: PSS elaboration/syntax parser tooling is deferred in automated tier-2 checks.</w:t>
+      </w:r>
+    </w:p>
+    <w:p>
+      <w:r>
+        <w:t>- Rationale: no pip-installable open-source PSS parser is currently available for stable CI integration.</w:t>
+      </w:r>
+    </w:p>
+    <w:p>
+      <w:r>
+        <w:t>- Impact: PSS validation is presently limited to tier-1 structural checks in v1b.</w:t>
+      </w:r>
+    </w:p>
+    <w:p>
+      <w:r>
+        <w:t>- Planned follow-up: add PSS elaboration tier when an open parser/elaborator tool becomes automation-ready.</w:t>
       </w:r>
     </w:p>
     <w:sectPr>

</xml_diff>

<commit_message>
feat(v3a): scaffold gen, intent/req auto-detect, 57 tests, file header standard
</commit_message>
<xml_diff>
--- a/docs/pssgen_sds.docx
+++ b/docs/pssgen_sds.docx
@@ -12889,6 +12889,201 @@
     <w:p>
       <w:r>
         <w:t>- Planned follow-up: add PSS elaboration tier when an open parser/elaborator tool becomes automation-ready.</w:t>
+      </w:r>
+    </w:p>
+    <w:p>
+      <w:r>
+        <w:br w:type="page"/>
+      </w:r>
+    </w:p>
+    <w:p>
+      <w:r>
+        <w:t>10.  Revision Update - v2 Reality</w:t>
+      </w:r>
+    </w:p>
+    <w:p>
+      <w:r>
+        <w:t>Revision Date: 2026-03-27</w:t>
+      </w:r>
+    </w:p>
+    <w:p>
+      <w:r>
+        <w:t>This addendum records the v2 implementation scope covering structured natural language intent input (v2a), C test case emission (v2b), and the Questa/QuestaSim emitter (v2c). All v1 system tests continue to pass. Non-e2e test suite: 41 tests passing at v2 completion.</w:t>
+      </w:r>
+    </w:p>
+    <w:p>
+      <w:r>
+        <w:t>10.1  Structured Natural Language Intent File (v2a Implemented)</w:t>
+      </w:r>
+    </w:p>
+    <w:p>
+      <w:r>
+        <w:t>- Feature: --intent &lt;file&gt; CLI flag accepting a .intent companion file for any HDL input.</w:t>
+      </w:r>
+    </w:p>
+    <w:p>
+      <w:r>
+        <w:t>- Intent file format: free-form plain text sections. No schema validation. Preferred section headings: reset behavior:, counting sequences:, coverage goals:, corner cases:, constraints:.</w:t>
+      </w:r>
+    </w:p>
+    <w:p>
+      <w:r>
+        <w:t>- IR field: ir.pss_intent (Optional[str], existed from v1 IR append-only design). Set to full file content when --intent is provided; remains None when omitted.</w:t>
+      </w:r>
+    </w:p>
+    <w:p>
+      <w:r>
+        <w:t>- JobSpec change: intent_file: Optional[str] = None added to orchestrator.JobSpec (append-only).</w:t>
+      </w:r>
+    </w:p>
+    <w:p>
+      <w:r>
+        <w:t>- Orchestrator change: reads intent_file, populates ir.pss_intent, and emits a verbose log line confirming the intent file was loaded.</w:t>
+      </w:r>
+    </w:p>
+    <w:p>
+      <w:r>
+        <w:t>- PSS agent change (no_llm=True): ir.pss_intent is passed to the Jinja2 template context. The PSS template emits the intent text as a structured C-style block comment at the top of the generated model when pss_intent is present.</w:t>
+      </w:r>
+    </w:p>
+    <w:p>
+      <w:r>
+        <w:t>- PSS agent change (no_llm=False): when ir.pss_intent is not None, the LLM prompt includes the rendered skeleton, IR context, and the full intent text with an explicit instruction to produce specific PSS constraints and coverage goals rather than generic placeholders. When ir.pss_intent is None the existing IR-only prompt path is used unchanged.</w:t>
+      </w:r>
+    </w:p>
+    <w:p>
+      <w:r>
+        <w:t>- Template change: templates/pss/component.pss.jinja includes a {% if pss_intent %} block that formats the intent text as a multi-line /* */ comment preserving all section headings.</w:t>
+      </w:r>
+    </w:p>
+    <w:p>
+      <w:r>
+        <w:t>- Tests added: test_pss_gen_with_intent_includes_comment, test_pss_gen_without_intent_unchanged, test_intent_file_loads_into_ir. All 3 pass.</w:t>
+      </w:r>
+    </w:p>
+    <w:p>
+      <w:r>
+        <w:t>- Done condition satisfied: pssgen --input counter.vhd --intent counter.intent --sim vivado --no-llm exits 0; up_down_counter.pss contains the intent comment block including section headings.</w:t>
+      </w:r>
+    </w:p>
+    <w:p>
+      <w:r>
+        <w:t>10.2  C Test Case Emission (v2b Implemented)</w:t>
+      </w:r>
+    </w:p>
+    <w:p>
+      <w:r>
+        <w:t>- Module: emitters/generic_c.py (promoted from stub).</w:t>
+      </w:r>
+    </w:p>
+    <w:p>
+      <w:r>
+        <w:t>- Activation: --sim generic.</w:t>
+      </w:r>
+    </w:p>
+    <w:p>
+      <w:r>
+        <w:t>- Algorithm: extracts PSS action names from ir.pss_model using regex pattern r"action\s+(\w+)\s*\{". Each captured name generates one void test_&lt;name&gt;(void) function.</w:t>
+      </w:r>
+    </w:p>
+    <w:p>
+      <w:r>
+        <w:t>- Harness: a run_all_pss_tests() function is rendered that calls all generated test functions.</w:t>
+      </w:r>
+    </w:p>
+    <w:p>
+      <w:r>
+        <w:t>- Template: templates/c/test_functions.c.jinja. Output filename: &lt;design_name&gt;_pss_tests.c.</w:t>
+      </w:r>
+    </w:p>
+    <w:p>
+      <w:r>
+        <w:t>- Graceful degradation: if ir.pss_model is None or has no action declarations, writes a C file with header comment and an empty run_all_pss_tests() stub.</w:t>
+      </w:r>
+    </w:p>
+    <w:p>
+      <w:r>
+        <w:t>- Behavior: writes all other artifacts to out_dir (consistent with vivado emitter), then appends the C file. Returns list of all written paths.</w:t>
+      </w:r>
+    </w:p>
+    <w:p>
+      <w:r>
+        <w:t>- OI-11: C artifact tier-2 syntax check is deferred. Future: call gcc --syntax-only on .c files. Requires gcc on PATH; skip gracefully if absent.</w:t>
+      </w:r>
+    </w:p>
+    <w:p>
+      <w:r>
+        <w:t>- Done condition satisfied: pssgen --input counter.vhd --intent counter.intent --sim generic --no-llm exits 0 and produces up_down_counter_pss_tests.c containing at least one void test_ function and run_all_pss_tests().</w:t>
+      </w:r>
+    </w:p>
+    <w:p>
+      <w:r>
+        <w:t>10.3  Questa/QuestaSim Emitter (v2c Implemented)</w:t>
+      </w:r>
+    </w:p>
+    <w:p>
+      <w:r>
+        <w:t>- Module: emitters/questa.py (promoted from stub).</w:t>
+      </w:r>
+    </w:p>
+    <w:p>
+      <w:r>
+        <w:t>- Activation: --sim questa.</w:t>
+      </w:r>
+    </w:p>
+    <w:p>
+      <w:r>
+        <w:t>- Output artifacts: all .sv files, the .pss file, and a Makefile. The Vivado-specific build.tcl is intentionally excluded -- Questa uses make.</w:t>
+      </w:r>
+    </w:p>
+    <w:p>
+      <w:r>
+        <w:t>- Makefile: rendered from templates/uvm/build_questa.mk.jinja. Uses vlog for compilation and vsim for simulation, matching the Questa/QuestaSim CLI interface.</w:t>
+      </w:r>
+    </w:p>
+    <w:p>
+      <w:r>
+        <w:t>- Checker tier-2: calls vlog -quiet on .sv files when sim_target is "questa". Skips gracefully if vlog is not installed.</w:t>
+      </w:r>
+    </w:p>
+    <w:p>
+      <w:r>
+        <w:t>- Architectural note: .sv file content is simulator-independent; both Vivado and Questa emitters write the same structure_gen artifact content. Simulator-specific knowledge is confined to the emitter and the Makefile/Tcl template.</w:t>
+      </w:r>
+    </w:p>
+    <w:p>
+      <w:r>
+        <w:t>- Done condition satisfied: pssgen --input counter.vhd --sim questa --no-llm exits 0 and produces Makefile alongside 7 .sv files and the .pss model.</w:t>
+      </w:r>
+    </w:p>
+    <w:p>
+      <w:r>
+        <w:t>10.4  Open Issues Introduced in v2</w:t>
+      </w:r>
+    </w:p>
+    <w:p>
+      <w:r>
+        <w:t>- OI-11: C artifact tier-2 syntax check deferred. Implementation note recorded in checkers/verifier.py _tier2_syntax. Planned follow-up: add gcc --syntax-only check when gcc is confirmed available on all CI targets.</w:t>
+      </w:r>
+    </w:p>
+    <w:p>
+      <w:r>
+        <w:t>10.5  Emission Target Summary at v2</w:t>
+      </w:r>
+    </w:p>
+    <w:p>
+      <w:r>
+        <w:t>- --sim vivado  (v0):    Emits 6 .sv UVM scaffold files + build.tcl + &lt;design_name&gt;.pss.</w:t>
+      </w:r>
+    </w:p>
+    <w:p>
+      <w:r>
+        <w:t>- --sim questa  (v2c):   Emits 6 .sv UVM scaffold files + Makefile + &lt;design_name&gt;.pss.</w:t>
+      </w:r>
+    </w:p>
+    <w:p>
+      <w:r>
+        <w:t>- --sim generic (v2b):   Emits 6 .sv UVM scaffold files + build.tcl + &lt;design_name&gt;.pss + &lt;design_name&gt;_pss_tests.c.</w:t>
       </w:r>
     </w:p>
     <w:sectPr>

</xml_diff>